<commit_message>
Simplify commander DOCX template's Acties section
Actie/Doel/Resultaat/Toelichting as repeating labelled paragraph blocks
(not a cramped table) with unlimited reflowing writing room per field.
Drops the old "Is het doel bereikt?" table entirely (spec: discussed live
during the AAR instead of asked in the report). Resultaat is free text,
not a forced 3-way Geslaagd/Gedeeltelijk/Niet-geslaagd pick — redundant
with an already-descriptive result, so the strict outcome matching and its
validation warnings are gone too. Regenerated the template.docx and synced
the synthetic fixture data to match.

Co-Authored-By: Claude Sonnet 5 <noreply@anthropic.com>
</commit_message>
<xml_diff>
--- a/templates/commander_report_template.docx
+++ b/templates/commander_report_template.docx
@@ -7,12 +7,12 @@
         <w:pStyle w:val="Title"/>
       </w:pPr>
       <w:r>
-        <w:t>AAR — Commandantenverslag</w:t>
+        <w:t>AAR — Persoonlijk verslag</w:t>
       </w:r>
     </w:p>
     <w:p>
       <w:r>
-        <w:t>Vul dit verslag zo volledig mogelijk in. Beschrijf wat u zelf hebt waargenomen, geweten en besloten op het moment zelf — niet wat achteraf bleek. Gebruik voor de verhalende delen gerust uw eigen woorden.</w:t>
+        <w:t>Kort, duidelijk en specifiek — geen volledig verhaal nodig. Wat u zelf zag, wist en besloot op dat moment, niet wat achteraf bleek. Details bespreken we samen tijdens de AAR.</w:t>
       </w:r>
     </w:p>
     <w:p>
@@ -40,7 +40,7 @@
           </w:tcPr>
           <w:p>
             <w:r>
-              <w:t>Roepnummer</w:t>
+              <w:t>Callsign</w:t>
             </w:r>
           </w:p>
         </w:tc>
@@ -60,7 +60,7 @@
           </w:tcPr>
           <w:p>
             <w:r>
-              <w:t>Officiële eenheidsnaam</w:t>
+              <w:t>Officiële eenheidsnaam (bv. 1H PZ)</w:t>
             </w:r>
           </w:p>
         </w:tc>
@@ -119,7 +119,7 @@
         <w:pStyle w:val="Heading1"/>
       </w:pPr>
       <w:r>
-        <w:t>B. Eerste en relevante waarnemingen</w:t>
+        <w:t>B. Feiten, info en waarnemingen bij aankomst</w:t>
       </w:r>
     </w:p>
     <w:p/>
@@ -128,7 +128,233 @@
         <w:pStyle w:val="Heading1"/>
       </w:pPr>
       <w:r>
-        <w:t>C. Informatiepositie</w:t>
+        <w:t>C. Acties</w:t>
+      </w:r>
+    </w:p>
+    <w:p>
+      <w:r>
+        <w:t>Eén blok per actie: wat deed u (Actie), met welk doel (Doel), en wat was het resultaat (Resultaat)? Voeg een Toelichting toe als het niet volledig lukte. Meer acties dan de onderstaande blokken? Kopieer een blok en plak het eronder.</w:t>
+      </w:r>
+    </w:p>
+    <w:p>
+      <w:pPr>
+        <w:spacing w:before="360" w:after="80"/>
+      </w:pPr>
+      <w:r>
+        <w:rPr>
+          <w:b/>
+          <w:sz w:val="26"/>
+        </w:rPr>
+        <w:t>Actie 1:</w:t>
+      </w:r>
+    </w:p>
+    <w:p>
+      <w:pPr>
+        <w:spacing w:after="200"/>
+      </w:pPr>
+    </w:p>
+    <w:p>
+      <w:pPr>
+        <w:spacing w:before="120" w:after="40"/>
+        <w:ind w:left="280"/>
+      </w:pPr>
+      <w:r>
+        <w:rPr>
+          <w:b/>
+        </w:rPr>
+        <w:t>Doel:</w:t>
+      </w:r>
+    </w:p>
+    <w:p>
+      <w:pPr>
+        <w:spacing w:after="160"/>
+        <w:ind w:left="280"/>
+      </w:pPr>
+    </w:p>
+    <w:p>
+      <w:pPr>
+        <w:spacing w:before="120" w:after="40"/>
+        <w:ind w:left="280"/>
+      </w:pPr>
+      <w:r>
+        <w:rPr>
+          <w:b/>
+        </w:rPr>
+        <w:t>Resultaat:</w:t>
+      </w:r>
+    </w:p>
+    <w:p>
+      <w:pPr>
+        <w:spacing w:after="160"/>
+        <w:ind w:left="280"/>
+      </w:pPr>
+    </w:p>
+    <w:p>
+      <w:pPr>
+        <w:spacing w:before="120" w:after="40"/>
+        <w:ind w:left="280"/>
+      </w:pPr>
+      <w:r>
+        <w:rPr>
+          <w:b/>
+        </w:rPr>
+        <w:t>Toelichting (optioneel, bv. als het niet volledig lukte: waarom):</w:t>
+      </w:r>
+    </w:p>
+    <w:p>
+      <w:pPr>
+        <w:spacing w:after="160"/>
+        <w:ind w:left="280"/>
+      </w:pPr>
+    </w:p>
+    <w:p>
+      <w:pPr>
+        <w:spacing w:before="360" w:after="80"/>
+      </w:pPr>
+      <w:r>
+        <w:rPr>
+          <w:b/>
+          <w:sz w:val="26"/>
+        </w:rPr>
+        <w:t>Actie 2:</w:t>
+      </w:r>
+    </w:p>
+    <w:p>
+      <w:pPr>
+        <w:spacing w:after="200"/>
+      </w:pPr>
+    </w:p>
+    <w:p>
+      <w:pPr>
+        <w:spacing w:before="120" w:after="40"/>
+        <w:ind w:left="280"/>
+      </w:pPr>
+      <w:r>
+        <w:rPr>
+          <w:b/>
+        </w:rPr>
+        <w:t>Doel:</w:t>
+      </w:r>
+    </w:p>
+    <w:p>
+      <w:pPr>
+        <w:spacing w:after="160"/>
+        <w:ind w:left="280"/>
+      </w:pPr>
+    </w:p>
+    <w:p>
+      <w:pPr>
+        <w:spacing w:before="120" w:after="40"/>
+        <w:ind w:left="280"/>
+      </w:pPr>
+      <w:r>
+        <w:rPr>
+          <w:b/>
+        </w:rPr>
+        <w:t>Resultaat:</w:t>
+      </w:r>
+    </w:p>
+    <w:p>
+      <w:pPr>
+        <w:spacing w:after="160"/>
+        <w:ind w:left="280"/>
+      </w:pPr>
+    </w:p>
+    <w:p>
+      <w:pPr>
+        <w:spacing w:before="120" w:after="40"/>
+        <w:ind w:left="280"/>
+      </w:pPr>
+      <w:r>
+        <w:rPr>
+          <w:b/>
+        </w:rPr>
+        <w:t>Toelichting (optioneel, bv. als het niet volledig lukte: waarom):</w:t>
+      </w:r>
+    </w:p>
+    <w:p>
+      <w:pPr>
+        <w:spacing w:after="160"/>
+        <w:ind w:left="280"/>
+      </w:pPr>
+    </w:p>
+    <w:p>
+      <w:pPr>
+        <w:spacing w:before="360" w:after="80"/>
+      </w:pPr>
+      <w:r>
+        <w:rPr>
+          <w:b/>
+          <w:sz w:val="26"/>
+        </w:rPr>
+        <w:t>Actie 3:</w:t>
+      </w:r>
+    </w:p>
+    <w:p>
+      <w:pPr>
+        <w:spacing w:after="200"/>
+      </w:pPr>
+    </w:p>
+    <w:p>
+      <w:pPr>
+        <w:spacing w:before="120" w:after="40"/>
+        <w:ind w:left="280"/>
+      </w:pPr>
+      <w:r>
+        <w:rPr>
+          <w:b/>
+        </w:rPr>
+        <w:t>Doel:</w:t>
+      </w:r>
+    </w:p>
+    <w:p>
+      <w:pPr>
+        <w:spacing w:after="160"/>
+        <w:ind w:left="280"/>
+      </w:pPr>
+    </w:p>
+    <w:p>
+      <w:pPr>
+        <w:spacing w:before="120" w:after="40"/>
+        <w:ind w:left="280"/>
+      </w:pPr>
+      <w:r>
+        <w:rPr>
+          <w:b/>
+        </w:rPr>
+        <w:t>Resultaat:</w:t>
+      </w:r>
+    </w:p>
+    <w:p>
+      <w:pPr>
+        <w:spacing w:after="160"/>
+        <w:ind w:left="280"/>
+      </w:pPr>
+    </w:p>
+    <w:p>
+      <w:pPr>
+        <w:spacing w:before="120" w:after="40"/>
+        <w:ind w:left="280"/>
+      </w:pPr>
+      <w:r>
+        <w:rPr>
+          <w:b/>
+        </w:rPr>
+        <w:t>Toelichting (optioneel, bv. als het niet volledig lukte: waarom):</w:t>
+      </w:r>
+    </w:p>
+    <w:p>
+      <w:pPr>
+        <w:spacing w:after="160"/>
+        <w:ind w:left="280"/>
+      </w:pPr>
+    </w:p>
+    <w:p>
+      <w:pPr>
+        <w:pStyle w:val="Heading1"/>
+      </w:pPr>
+      <w:r>
+        <w:t>D. Wat ging goed</w:t>
       </w:r>
     </w:p>
     <w:p/>
@@ -137,7 +363,7 @@
         <w:pStyle w:val="Heading1"/>
       </w:pPr>
       <w:r>
-        <w:t>D. Inschatting</w:t>
+        <w:t>E. Wat kon beter, en waarom</w:t>
       </w:r>
     </w:p>
     <w:p/>
@@ -146,7 +372,7 @@
         <w:pStyle w:val="Heading1"/>
       </w:pPr>
       <w:r>
-        <w:t>E. Beslissing</w:t>
+        <w:t>F. Overige opmerkingen (vrij in te vullen)</w:t>
       </w:r>
     </w:p>
     <w:p/>
@@ -155,129 +381,7 @@
         <w:pStyle w:val="Heading1"/>
       </w:pPr>
       <w:r>
-        <w:t>F. Doel / intentie</w:t>
-      </w:r>
-    </w:p>
-    <w:p/>
-    <w:p>
-      <w:pPr>
-        <w:pStyle w:val="Heading1"/>
-      </w:pPr>
-      <w:r>
-        <w:t>G. Verloop / verhaal</w:t>
-      </w:r>
-    </w:p>
-    <w:p/>
-    <w:p>
-      <w:pPr>
-        <w:pStyle w:val="Heading1"/>
-      </w:pPr>
-      <w:r>
-        <w:t>H. Resultaat</w:t>
-      </w:r>
-    </w:p>
-    <w:p/>
-    <w:p>
-      <w:pPr>
-        <w:pStyle w:val="Heading1"/>
-      </w:pPr>
-      <w:r>
-        <w:t>I. Is het doel bereikt?</w:t>
-      </w:r>
-    </w:p>
-    <w:tbl>
-      <w:tblPr>
-        <w:tblStyle w:val="LightGrid-Accent1"/>
-        <w:tblW w:type="auto" w:w="0"/>
-        <w:tblLook w:firstColumn="1" w:firstRow="1" w:lastColumn="0" w:lastRow="0" w:noHBand="0" w:noVBand="1" w:val="04A0"/>
-      </w:tblPr>
-      <w:tblGrid>
-        <w:gridCol w:w="4320"/>
-        <w:gridCol w:w="4320"/>
-      </w:tblGrid>
-      <w:tr>
-        <w:tc>
-          <w:tcPr>
-            <w:tcW w:type="dxa" w:w="4320"/>
-          </w:tcPr>
-          <w:p>
-            <w:r>
-              <w:t>Antwoord (Ja / Gedeeltelijk / Nee / Niet te beoordelen)</w:t>
-            </w:r>
-          </w:p>
-        </w:tc>
-        <w:tc>
-          <w:tcPr>
-            <w:tcW w:type="dxa" w:w="4320"/>
-          </w:tcPr>
-          <w:p>
-            <w:r/>
-          </w:p>
-        </w:tc>
-      </w:tr>
-      <w:tr>
-        <w:tc>
-          <w:tcPr>
-            <w:tcW w:type="dxa" w:w="4320"/>
-          </w:tcPr>
-          <w:p>
-            <w:r>
-              <w:t>Toelichting bij doelbereik</w:t>
-            </w:r>
-          </w:p>
-        </w:tc>
-        <w:tc>
-          <w:tcPr>
-            <w:tcW w:type="dxa" w:w="4320"/>
-          </w:tcPr>
-          <w:p>
-            <w:r/>
-          </w:p>
-        </w:tc>
-      </w:tr>
-    </w:tbl>
-    <w:p>
-      <w:pPr>
-        <w:pStyle w:val="Heading1"/>
-      </w:pPr>
-      <w:r>
-        <w:t>J. Wat ging goed?</w:t>
-      </w:r>
-    </w:p>
-    <w:p/>
-    <w:p>
-      <w:pPr>
-        <w:pStyle w:val="Heading1"/>
-      </w:pPr>
-      <w:r>
-        <w:t>K. Wat ging minder goed?</w:t>
-      </w:r>
-    </w:p>
-    <w:p/>
-    <w:p>
-      <w:pPr>
-        <w:pStyle w:val="Heading1"/>
-      </w:pPr>
-      <w:r>
-        <w:t>L. Waarom?</w:t>
-      </w:r>
-    </w:p>
-    <w:p/>
-    <w:p>
-      <w:pPr>
-        <w:pStyle w:val="Heading1"/>
-      </w:pPr>
-      <w:r>
-        <w:t>M. Twijfels / veronderstellingen / onzekerheden</w:t>
-      </w:r>
-    </w:p>
-    <w:p/>
-    <w:p>
-      <w:pPr>
-        <w:pStyle w:val="Heading1"/>
-      </w:pPr>
-      <w:r>
-        <w:t>N. Overige relevante waarnemingen</w:t>
+        <w:t>G. Problemen of moeilijkheden die ervaren werden</w:t>
       </w:r>
     </w:p>
     <w:p/>
@@ -710,7 +814,7 @@
     <w:pPr>
       <w:keepNext/>
       <w:keepLines/>
-      <w:spacing w:before="480" w:after="0"/>
+      <w:spacing w:before="400" w:after="120"/>
       <w:outlineLvl w:val="0"/>
     </w:pPr>
     <w:rPr>
@@ -718,7 +822,7 @@
       <w:b/>
       <w:bCs/>
       <w:color w:val="365F91" w:themeColor="accent1" w:themeShade="BF"/>
-      <w:sz w:val="28"/>
+      <w:sz w:val="26"/>
       <w:szCs w:val="28"/>
     </w:rPr>
   </w:style>

</xml_diff>